<commit_message>
refact(form): reestructurar formulario de contacto y agregar logs en backend
</commit_message>
<xml_diff>
--- a/Documentación sistema cursos.docx
+++ b/Documentación sistema cursos.docx
@@ -48,8 +48,13 @@
         <w:t>Usuario:</w:t>
       </w:r>
       <w:r>
-        <w:t> admin</w:t>
-      </w:r>
+        <w:t> </w:t>
+      </w:r>
+      <w:proofErr w:type="spellStart"/>
+      <w:r>
+        <w:t>admin</w:t>
+      </w:r>
+      <w:proofErr w:type="spellEnd"/>
     </w:p>
     <w:p>
       <w:pPr>
@@ -66,7 +71,53 @@
         <w:t>Contraseña:</w:t>
       </w:r>
       <w:r>
-        <w:t> ll2026(*)D</w:t>
+        <w:t> ll2026(</w:t>
+      </w:r>
+      <w:proofErr w:type="gramStart"/>
+      <w:r>
+        <w:t>*)D</w:t>
+      </w:r>
+      <w:proofErr w:type="gramEnd"/>
+    </w:p>
+    <w:p>
+      <w:pPr>
+        <w:rPr>
+          <w:b/>
+          <w:bCs/>
+        </w:rPr>
+      </w:pPr>
+    </w:p>
+    <w:p>
+      <w:pPr>
+        <w:rPr>
+          <w:b/>
+          <w:bCs/>
+        </w:rPr>
+      </w:pPr>
+      <w:r>
+        <w:rPr>
+          <w:b/>
+          <w:bCs/>
+        </w:rPr>
+        <w:t>Correo:</w:t>
+      </w:r>
+    </w:p>
+    <w:p>
+      <w:r>
+        <w:t xml:space="preserve">Gmail: </w:t>
+      </w:r>
+      <w:hyperlink r:id="rId5" w:history="1">
+        <w:r>
+          <w:rPr>
+            <w:rStyle w:val="Hipervnculo"/>
+          </w:rPr>
+          <w:t>llcursoschapademota@gmail.com</w:t>
+        </w:r>
+      </w:hyperlink>
+    </w:p>
+    <w:p>
+      <w:r>
+        <w:t>Contraseña: ll2026*MTZ</w:t>
       </w:r>
     </w:p>
     <w:p/>
@@ -110,7 +161,17 @@
         <w:t>Usuario:</w:t>
       </w:r>
       <w:r>
-        <w:t> victor.maya | </w:t>
+        <w:t> </w:t>
+      </w:r>
+      <w:proofErr w:type="spellStart"/>
+      <w:proofErr w:type="gramStart"/>
+      <w:r>
+        <w:t>victor.maya</w:t>
+      </w:r>
+      <w:proofErr w:type="spellEnd"/>
+      <w:proofErr w:type="gramEnd"/>
+      <w:r>
+        <w:t> | </w:t>
       </w:r>
       <w:r>
         <w:rPr>
@@ -138,7 +199,17 @@
         <w:t>Usuario:</w:t>
       </w:r>
       <w:r>
-        <w:t> liliana.silvestre | </w:t>
+        <w:t> </w:t>
+      </w:r>
+      <w:proofErr w:type="spellStart"/>
+      <w:proofErr w:type="gramStart"/>
+      <w:r>
+        <w:t>liliana.silvestre</w:t>
+      </w:r>
+      <w:proofErr w:type="spellEnd"/>
+      <w:proofErr w:type="gramEnd"/>
+      <w:r>
+        <w:t> | </w:t>
       </w:r>
       <w:r>
         <w:rPr>
@@ -166,7 +237,17 @@
         <w:t>Usuario:</w:t>
       </w:r>
       <w:r>
-        <w:t> liliana.martinez | </w:t>
+        <w:t> </w:t>
+      </w:r>
+      <w:proofErr w:type="spellStart"/>
+      <w:proofErr w:type="gramStart"/>
+      <w:r>
+        <w:t>liliana.martinez</w:t>
+      </w:r>
+      <w:proofErr w:type="spellEnd"/>
+      <w:proofErr w:type="gramEnd"/>
+      <w:r>
+        <w:t> | </w:t>
       </w:r>
       <w:r>
         <w:rPr>
@@ -180,6 +261,125 @@
       </w:r>
     </w:p>
     <w:p/>
+    <w:p>
+      <w:r>
+        <w:rPr>
+          <w:b/>
+          <w:bCs/>
+        </w:rPr>
+        <w:t>Usuario:</w:t>
+      </w:r>
+      <w:r>
+        <w:rPr>
+          <w:b/>
+          <w:bCs/>
+        </w:rPr>
+        <w:t xml:space="preserve"> </w:t>
+      </w:r>
+      <w:proofErr w:type="spellStart"/>
+      <w:proofErr w:type="gramStart"/>
+      <w:r>
+        <w:t>sofia.maya</w:t>
+      </w:r>
+      <w:proofErr w:type="gramEnd"/>
+      <w:r>
+        <w:t>.m.b</w:t>
+      </w:r>
+      <w:proofErr w:type="spellEnd"/>
+    </w:p>
+    <w:p>
+      <w:r>
+        <w:rPr>
+          <w:b/>
+          <w:bCs/>
+        </w:rPr>
+        <w:t>Contraseña:</w:t>
+      </w:r>
+      <w:r>
+        <w:rPr>
+          <w:b/>
+          <w:bCs/>
+        </w:rPr>
+        <w:t xml:space="preserve"> </w:t>
+      </w:r>
+      <w:proofErr w:type="gramStart"/>
+      <w:r>
+        <w:t>IA-1234-b!</w:t>
+      </w:r>
+      <w:proofErr w:type="gramEnd"/>
+    </w:p>
+    <w:p/>
+    <w:p/>
+    <w:p/>
+    <w:p>
+      <w:r>
+        <w:t>TIP</w:t>
+      </w:r>
+    </w:p>
+    <w:p>
+      <w:r>
+        <w:t>Si en el futuro el puerto 5000 se vuelve a quedar trabado por un proceso colgado, puedes liberarlo rápidamente abriendo PowerShell y ejecutando:</w:t>
+      </w:r>
+    </w:p>
+    <w:p>
+      <w:proofErr w:type="spellStart"/>
+      <w:r>
+        <w:t>powershell</w:t>
+      </w:r>
+      <w:proofErr w:type="spellEnd"/>
+    </w:p>
+    <w:p>
+      <w:r>
+        <w:t>Stop-</w:t>
+      </w:r>
+      <w:proofErr w:type="spellStart"/>
+      <w:r>
+        <w:t>Process</w:t>
+      </w:r>
+      <w:proofErr w:type="spellEnd"/>
+      <w:r>
+        <w:t xml:space="preserve"> -Id (</w:t>
+      </w:r>
+      <w:proofErr w:type="spellStart"/>
+      <w:r>
+        <w:t>Get-NetTCPConnection</w:t>
+      </w:r>
+      <w:proofErr w:type="spellEnd"/>
+      <w:r>
+        <w:t xml:space="preserve"> -</w:t>
+      </w:r>
+      <w:proofErr w:type="spellStart"/>
+      <w:r>
+        <w:t>LocalPort</w:t>
+      </w:r>
+      <w:proofErr w:type="spellEnd"/>
+      <w:r>
+        <w:t xml:space="preserve"> 5000</w:t>
+      </w:r>
+      <w:proofErr w:type="gramStart"/>
+      <w:r>
+        <w:t>).</w:t>
+      </w:r>
+      <w:proofErr w:type="spellStart"/>
+      <w:r>
+        <w:t>OwningProcess</w:t>
+      </w:r>
+      <w:proofErr w:type="spellEnd"/>
+      <w:proofErr w:type="gramEnd"/>
+      <w:r>
+        <w:t xml:space="preserve"> -</w:t>
+      </w:r>
+      <w:proofErr w:type="spellStart"/>
+      <w:r>
+        <w:t>Force</w:t>
+      </w:r>
+      <w:proofErr w:type="spellEnd"/>
+    </w:p>
+    <w:p>
+      <w:r>
+        <w:br/>
+      </w:r>
+    </w:p>
     <w:p/>
     <w:sectPr>
       <w:pgSz w:w="12240" w:h="15840"/>

</xml_diff>

<commit_message>
feat: actualiza la vista del docente, barra lateral, inicio de sesión y base de datos
</commit_message>
<xml_diff>
--- a/Documentación sistema cursos.docx
+++ b/Documentación sistema cursos.docx
@@ -166,7 +166,7 @@
       <w:proofErr w:type="spellStart"/>
       <w:proofErr w:type="gramStart"/>
       <w:r>
-        <w:t>victor.maya</w:t>
+        <w:t>liliana.silvestre</w:t>
       </w:r>
       <w:proofErr w:type="spellEnd"/>
       <w:proofErr w:type="gramEnd"/>
@@ -181,7 +181,10 @@
         <w:t>Contraseña:</w:t>
       </w:r>
       <w:r>
-        <w:t> victor123</w:t>
+        <w:t> li</w:t>
+      </w:r>
+      <w:r>
+        <w:t>si2026</w:t>
       </w:r>
     </w:p>
     <w:p>
@@ -204,7 +207,7 @@
       <w:proofErr w:type="spellStart"/>
       <w:proofErr w:type="gramStart"/>
       <w:r>
-        <w:t>liliana.silvestre</w:t>
+        <w:t>liliana.martinez</w:t>
       </w:r>
       <w:proofErr w:type="spellEnd"/>
       <w:proofErr w:type="gramEnd"/>
@@ -219,45 +222,10 @@
         <w:t>Contraseña:</w:t>
       </w:r>
       <w:r>
-        <w:t> liliana123</w:t>
-      </w:r>
-    </w:p>
-    <w:p>
-      <w:pPr>
-        <w:numPr>
-          <w:ilvl w:val="0"/>
-          <w:numId w:val="2"/>
-        </w:numPr>
-      </w:pPr>
-      <w:r>
-        <w:rPr>
-          <w:b/>
-          <w:bCs/>
-        </w:rPr>
-        <w:t>Usuario:</w:t>
-      </w:r>
-      <w:r>
         <w:t> </w:t>
       </w:r>
-      <w:proofErr w:type="spellStart"/>
-      <w:proofErr w:type="gramStart"/>
-      <w:r>
-        <w:t>liliana.martinez</w:t>
-      </w:r>
-      <w:proofErr w:type="spellEnd"/>
-      <w:proofErr w:type="gramEnd"/>
-      <w:r>
-        <w:t> | </w:t>
-      </w:r>
-      <w:r>
-        <w:rPr>
-          <w:b/>
-          <w:bCs/>
-        </w:rPr>
-        <w:t>Contraseña:</w:t>
-      </w:r>
-      <w:r>
-        <w:t> martinez123</w:t>
+      <w:r>
+        <w:t>lima2026</w:t>
       </w:r>
     </w:p>
     <w:p/>
@@ -1102,6 +1070,7 @@
   <w:style w:type="character" w:default="1" w:styleId="Fuentedeprrafopredeter">
     <w:name w:val="Default Paragraph Font"/>
     <w:uiPriority w:val="1"/>
+    <w:semiHidden/>
     <w:unhideWhenUsed/>
   </w:style>
   <w:style w:type="table" w:default="1" w:styleId="Tablanormal">

</xml_diff>